<commit_message>
Thryve letter: add both email addresses
Co-Authored-By: Claude Opus 5.5 <noreply@anthropic.com>
Claude-Session: https://claude.ai/code/session_01NjdMuB9buEkMmyf7HkyEWg
</commit_message>
<xml_diff>
--- a/applications/Thryve_Munich_Senior_Mechanical_Design_Engineer/Arunabha_Majumder_Cover_Letter_Senior_Mechanical_Design_Engineer_Munich.docx
+++ b/applications/Thryve_Munich_Senior_Mechanical_Design_Engineer/Arunabha_Majumder_Cover_Letter_Senior_Mechanical_Design_Engineer_Munich.docx
@@ -30,6 +30,19 @@
     </w:p>
     <w:p>
       <w:pPr>
+        <w:spacing w:after="0"/>
+      </w:pPr>
+      <w:r>
+        <w:rPr>
+          <w:b w:val="0"/>
+          <w:i w:val="0"/>
+          <w:sz w:val="19"/>
+        </w:rPr>
+        <w:t>+45 71 62 24 00  |  Aalborg, Denmark  |  somrkmv1997@gmail.com  |  97arunabhasit027@gmail.com</w:t>
+      </w:r>
+    </w:p>
+    <w:p>
+      <w:pPr>
         <w:spacing w:after="200"/>
       </w:pPr>
       <w:r>
@@ -38,7 +51,7 @@
           <w:i w:val="0"/>
           <w:sz w:val="19"/>
         </w:rPr>
-        <w:t>+45 71 62 24 00  |  Aalborg, Denmark  |  somrkmv1997@gmail.com  |  arunabha22.github.io/arunabha-majumder</w:t>
+        <w:t>Portfolio: arunabha22.github.io/arunabha-majumder</w:t>
       </w:r>
     </w:p>
     <w:p>

</xml_diff>